<commit_message>
Add Martabe WIs batch 7 (portable DO meter, elution survey)
Co-Authored-By: Claude Sonnet 5.5 <noreply@anthropic.com>
Claude-Session: https://claude.ai/code/session_0121qocWgsZdFAsne2oz9sHT
</commit_message>
<xml_diff>
--- a/SWI/201-Plant-Sampling/MM-4034-033-OR-03-SWI-PRO-MET-201-013-Gold-Elution-Electrowinning-and-Pre-Soak-Solution-Sampling-RevA.docx
+++ b/SWI/201-Plant-Sampling/MM-4034-033-OR-03-SWI-PRO-MET-201-013-Gold-Elution-Electrowinning-and-Pre-Soak-Solution-Sampling-RevA.docx
@@ -638,7 +638,7 @@
                 <w:sz w:val="17"/>
                 <w:szCs w:val="17"/>
               </w:rPr>
-              <w:t xml:space="preserve">DRAFT FOR REVIEW. Martabe work instruction 'Electrowinning Survey' (DOC-3-MET-PRS-WIN-00052-IE, v1.0, issued 25/01/2025) added as Section 6 Part B. Not approved until reviewed. JSEA JSEA-PRO-MET-201-013 must be checked.</w:t>
+              <w:t xml:space="preserve">DRAFT FOR REVIEW. Martabe work instructions 'Electrowinning Survey' (DOC-3-MET-PRS-WIN-00052-IE, issued 25/01/2025) as Part B and 'Elution Survey' (DOC-3-MET-PRS-WIN-00053-IE, issued 25/12/2024) as Part C added to Section 6. Not approved until reviewed. JSEA JSEA-PRO-MET-201-013 must be checked.</w:t>
             </w:r>
           </w:p>
         </w:tc>
@@ -2366,6 +2366,24 @@
     </w:p>
     <w:p>
       <w:pPr>
+        <w:pStyle w:val="ListParagraph"/>
+        <w:numPr>
+          <w:ilvl w:val="0"/>
+          <w:numId w:val="1"/>
+        </w:numPr>
+        <w:spacing w:after="60" w:line="245"/>
+      </w:pPr>
+      <w:r>
+        <w:rPr>
+          <w:rFonts w:ascii="Calibri" w:cs="Calibri" w:eastAsia="Calibri" w:hAnsi="Calibri"/>
+          <w:sz w:val="17"/>
+          <w:szCs w:val="17"/>
+        </w:rPr>
+        <w:t xml:space="preserve">[M] Marcy scale bucket as the sample catch bucket, 20 bright and 20 dark 250 mL bottles per elution survey, plastic sample bags labelled 'high cyanide'</w:t>
+      </w:r>
+    </w:p>
+    <w:p>
+      <w:pPr>
         <w:pStyle w:val="Heading1"/>
         <w:spacing w:after="120" w:before="260"/>
       </w:pPr>
@@ -2803,6 +2821,289 @@
     </w:p>
     <w:p>
       <w:pPr>
+        <w:spacing w:after="90" w:before="180" w:line="245"/>
+        <w:keepNext/>
+      </w:pPr>
+      <w:r>
+        <w:rPr>
+          <w:rFonts w:ascii="Calibri" w:cs="Calibri" w:eastAsia="Calibri" w:hAnsi="Calibri"/>
+          <w:b/>
+          <w:bCs/>
+          <w:color w:val="1F3864"/>
+          <w:sz w:val="19"/>
+          <w:szCs w:val="19"/>
+        </w:rPr>
+        <w:t xml:space="preserve">Part C - Elution survey: sampling through the heating stage [M]</w:t>
+      </w:r>
+    </w:p>
+    <w:p>
+      <w:pPr>
+        <w:spacing w:after="60" w:before="0" w:line="245"/>
+      </w:pPr>
+      <w:r>
+        <w:rPr>
+          <w:rFonts w:ascii="Calibri" w:cs="Calibri" w:eastAsia="Calibri" w:hAnsi="Calibri"/>
+          <w:sz w:val="17"/>
+          <w:szCs w:val="17"/>
+        </w:rPr>
+        <w:t xml:space="preserve">[M] = taken from the Martabe team work instruction "Elution Survey (DOC-3-MET-PRS-WIN-00053-IE)" (25/12/2024). [CONFIRM] = unspecified or inconsistent in the source; resolve before this instruction is approved for use. Parts A and B are unchanged.</w:t>
+      </w:r>
+    </w:p>
+    <w:p>
+      <w:pPr>
+        <w:spacing w:after="60" w:before="0" w:line="245"/>
+      </w:pPr>
+      <w:r>
+        <w:rPr>
+          <w:rFonts w:ascii="Calibri" w:cs="Calibri" w:eastAsia="Calibri" w:hAnsi="Calibri"/>
+          <w:sz w:val="17"/>
+          <w:szCs w:val="17"/>
+        </w:rPr>
+        <w:t xml:space="preserve">Purpose [M]: take a timed series of eluate samples through the elution heating stage. The source sample point is after the basket strainer.</w:t>
+      </w:r>
+    </w:p>
+    <w:p>
+      <w:pPr>
+        <w:ind w:left="280"/>
+        <w:spacing w:after="50" w:before="0" w:line="245"/>
+      </w:pPr>
+      <w:r>
+        <w:rPr>
+          <w:rFonts w:ascii="Calibri" w:cs="Calibri" w:eastAsia="Calibri" w:hAnsi="Calibri"/>
+          <w:b/>
+          <w:bCs/>
+          <w:sz w:val="17"/>
+          <w:szCs w:val="17"/>
+        </w:rPr>
+        <w:t xml:space="preserve">16.</w:t>
+      </w:r>
+      <w:r>
+        <w:rPr>
+          <w:rFonts w:ascii="Calibri" w:cs="Calibri" w:eastAsia="Calibri" w:hAnsi="Calibri"/>
+          <w:sz w:val="17"/>
+          <w:szCs w:val="17"/>
+        </w:rPr>
+        <w:t xml:space="preserve">  Take 5 minutes before starting ('Take 5'). Confirm Section 3 controls are in place and the 20 bright and 20 dark 250 mL bottles are ready and in good condition.</w:t>
+      </w:r>
+    </w:p>
+    <w:p>
+      <w:pPr>
+        <w:ind w:left="280"/>
+        <w:spacing w:after="50" w:before="0" w:line="245"/>
+      </w:pPr>
+      <w:r>
+        <w:rPr>
+          <w:rFonts w:ascii="Calibri" w:cs="Calibri" w:eastAsia="Calibri" w:hAnsi="Calibri"/>
+          <w:b/>
+          <w:bCs/>
+          <w:sz w:val="17"/>
+          <w:szCs w:val="17"/>
+        </w:rPr>
+        <w:t xml:space="preserve">17.</w:t>
+      </w:r>
+      <w:r>
+        <w:rPr>
+          <w:rFonts w:ascii="Calibri" w:cs="Calibri" w:eastAsia="Calibri" w:hAnsi="Calibri"/>
+          <w:sz w:val="17"/>
+          <w:szCs w:val="17"/>
+        </w:rPr>
+        <w:t xml:space="preserve">  Take the sample from the sampling point after the basket strainer. Put the Marcy scale bucket under the point to keep hands away from the hot solution.</w:t>
+      </w:r>
+    </w:p>
+    <w:p>
+      <w:pPr>
+        <w:ind w:left="280"/>
+        <w:spacing w:after="50" w:before="0" w:line="245"/>
+      </w:pPr>
+      <w:r>
+        <w:rPr>
+          <w:rFonts w:ascii="Calibri" w:cs="Calibri" w:eastAsia="Calibri" w:hAnsi="Calibri"/>
+          <w:b/>
+          <w:bCs/>
+          <w:sz w:val="17"/>
+          <w:szCs w:val="17"/>
+        </w:rPr>
+        <w:t xml:space="preserve">18.</w:t>
+      </w:r>
+      <w:r>
+        <w:rPr>
+          <w:rFonts w:ascii="Calibri" w:cs="Calibri" w:eastAsia="Calibri" w:hAnsi="Calibri"/>
+          <w:sz w:val="17"/>
+          <w:szCs w:val="17"/>
+        </w:rPr>
+        <w:t xml:space="preserve">  Open the valve a little and let the solution run for 3 to 4 seconds. Close the valve when the bucket is full.</w:t>
+      </w:r>
+    </w:p>
+    <w:p>
+      <w:pPr>
+        <w:ind w:left="280"/>
+        <w:spacing w:after="50" w:before="0" w:line="245"/>
+      </w:pPr>
+      <w:r>
+        <w:rPr>
+          <w:rFonts w:ascii="Calibri" w:cs="Calibri" w:eastAsia="Calibri" w:hAnsi="Calibri"/>
+          <w:b/>
+          <w:bCs/>
+          <w:sz w:val="17"/>
+          <w:szCs w:val="17"/>
+        </w:rPr>
+        <w:t xml:space="preserve">19.</w:t>
+      </w:r>
+      <w:r>
+        <w:rPr>
+          <w:rFonts w:ascii="Calibri" w:cs="Calibri" w:eastAsia="Calibri" w:hAnsi="Calibri"/>
+          <w:sz w:val="17"/>
+          <w:szCs w:val="17"/>
+        </w:rPr>
+        <w:t xml:space="preserve">  Let the solution cool, then pour it into a dark bottle and a bright bottle.</w:t>
+      </w:r>
+    </w:p>
+    <w:p>
+      <w:pPr>
+        <w:ind w:left="280"/>
+        <w:spacing w:after="50" w:before="0" w:line="245"/>
+      </w:pPr>
+      <w:r>
+        <w:rPr>
+          <w:rFonts w:ascii="Calibri" w:cs="Calibri" w:eastAsia="Calibri" w:hAnsi="Calibri"/>
+          <w:b/>
+          <w:bCs/>
+          <w:sz w:val="17"/>
+          <w:szCs w:val="17"/>
+        </w:rPr>
+        <w:t xml:space="preserve">20.</w:t>
+      </w:r>
+      <w:r>
+        <w:rPr>
+          <w:rFonts w:ascii="Calibri" w:cs="Calibri" w:eastAsia="Calibri" w:hAnsi="Calibri"/>
+          <w:sz w:val="17"/>
+          <w:szCs w:val="17"/>
+        </w:rPr>
+        <w:t xml:space="preserve">  Do NOT pour the remaining eluate on the floor. Send it to the cyanide-bearing waste stream (Section 7) and clean the bucket. [CONFIRM] the Martabe source says to pour the remainder on the floor and clean the bucket; this is hot cyanide-bearing eluate, so that instruction has not been carried over.</w:t>
+      </w:r>
+    </w:p>
+    <w:p>
+      <w:pPr>
+        <w:ind w:left="280"/>
+        <w:spacing w:after="50" w:before="0" w:line="245"/>
+      </w:pPr>
+      <w:r>
+        <w:rPr>
+          <w:rFonts w:ascii="Calibri" w:cs="Calibri" w:eastAsia="Calibri" w:hAnsi="Calibri"/>
+          <w:b/>
+          <w:bCs/>
+          <w:sz w:val="17"/>
+          <w:szCs w:val="17"/>
+        </w:rPr>
+        <w:t xml:space="preserve">21.</w:t>
+      </w:r>
+      <w:r>
+        <w:rPr>
+          <w:rFonts w:ascii="Calibri" w:cs="Calibri" w:eastAsia="Calibri" w:hAnsi="Calibri"/>
+          <w:sz w:val="17"/>
+          <w:szCs w:val="17"/>
+        </w:rPr>
+        <w:t xml:space="preserve">  Take the first sample when the heating stage reaches 65 degrees C. Record the time and temperature.</w:t>
+      </w:r>
+    </w:p>
+    <w:p>
+      <w:pPr>
+        <w:ind w:left="280"/>
+        <w:spacing w:after="50" w:before="0" w:line="245"/>
+      </w:pPr>
+      <w:r>
+        <w:rPr>
+          <w:rFonts w:ascii="Calibri" w:cs="Calibri" w:eastAsia="Calibri" w:hAnsi="Calibri"/>
+          <w:b/>
+          <w:bCs/>
+          <w:sz w:val="17"/>
+          <w:szCs w:val="17"/>
+        </w:rPr>
+        <w:t xml:space="preserve">22.</w:t>
+      </w:r>
+      <w:r>
+        <w:rPr>
+          <w:rFonts w:ascii="Calibri" w:cs="Calibri" w:eastAsia="Calibri" w:hAnsi="Calibri"/>
+          <w:sz w:val="17"/>
+          <w:szCs w:val="17"/>
+        </w:rPr>
+        <w:t xml:space="preserve">  Take the second sample when the heating stage reaches 100 degrees C. Record the time and temperature.</w:t>
+      </w:r>
+    </w:p>
+    <w:p>
+      <w:pPr>
+        <w:ind w:left="280"/>
+        <w:spacing w:after="50" w:before="0" w:line="245"/>
+      </w:pPr>
+      <w:r>
+        <w:rPr>
+          <w:rFonts w:ascii="Calibri" w:cs="Calibri" w:eastAsia="Calibri" w:hAnsi="Calibri"/>
+          <w:b/>
+          <w:bCs/>
+          <w:sz w:val="17"/>
+          <w:szCs w:val="17"/>
+        </w:rPr>
+        <w:t xml:space="preserve">23.</w:t>
+      </w:r>
+      <w:r>
+        <w:rPr>
+          <w:rFonts w:ascii="Calibri" w:cs="Calibri" w:eastAsia="Calibri" w:hAnsi="Calibri"/>
+          <w:sz w:val="17"/>
+          <w:szCs w:val="17"/>
+        </w:rPr>
+        <w:t xml:space="preserve">  Take later samples every 30 minutes, or at the end of the stage.</w:t>
+      </w:r>
+    </w:p>
+    <w:p>
+      <w:pPr>
+        <w:ind w:left="280"/>
+        <w:spacing w:after="50" w:before="0" w:line="245"/>
+      </w:pPr>
+      <w:r>
+        <w:rPr>
+          <w:rFonts w:ascii="Calibri" w:cs="Calibri" w:eastAsia="Calibri" w:hAnsi="Calibri"/>
+          <w:b/>
+          <w:bCs/>
+          <w:sz w:val="17"/>
+          <w:szCs w:val="17"/>
+        </w:rPr>
+        <w:t xml:space="preserve">24.</w:t>
+      </w:r>
+      <w:r>
+        <w:rPr>
+          <w:rFonts w:ascii="Calibri" w:cs="Calibri" w:eastAsia="Calibri" w:hAnsi="Calibri"/>
+          <w:sz w:val="17"/>
+          <w:szCs w:val="17"/>
+        </w:rPr>
+        <w:t xml:space="preserve">  Check every bottle is tightly closed and correctly labelled. Put all bottles in a sample bag labelled 'high cyanide'. Fill the laboratory form for Au, Ag, Cu and free cyanide assay (estimated NaCN 3000 ppm). [CONFIRM] the source names the ITS laboratory; use the Mt. Morgan laboratory.</w:t>
+      </w:r>
+    </w:p>
+    <w:p>
+      <w:pPr>
+        <w:ind w:left="280"/>
+        <w:spacing w:after="50" w:before="0" w:line="245"/>
+      </w:pPr>
+      <w:r>
+        <w:rPr>
+          <w:rFonts w:ascii="Calibri" w:cs="Calibri" w:eastAsia="Calibri" w:hAnsi="Calibri"/>
+          <w:b/>
+          <w:bCs/>
+          <w:sz w:val="17"/>
+          <w:szCs w:val="17"/>
+        </w:rPr>
+        <w:t xml:space="preserve">25.</w:t>
+      </w:r>
+      <w:r>
+        <w:rPr>
+          <w:rFonts w:ascii="Calibri" w:cs="Calibri" w:eastAsia="Calibri" w:hAnsi="Calibri"/>
+          <w:sz w:val="17"/>
+          <w:szCs w:val="17"/>
+        </w:rPr>
+        <w:t xml:space="preserve">  Record the elution survey data in 'G:\Processing\5. Metallurgy\Metallurgy Lab\04 Metlab Data\Elution Survey.xlsx'.</w:t>
+      </w:r>
+    </w:p>
+    <w:p>
+      <w:pPr>
         <w:pStyle w:val="Heading1"/>
         <w:spacing w:after="120" w:before="260"/>
       </w:pPr>
@@ -3084,6 +3385,24 @@
           <w:szCs w:val="17"/>
         </w:rPr>
         <w:t xml:space="preserve">Martabe work instruction 'Electrowinning Survey' DOC-3-MET-PRS-WIN-00052-IE v1.0 (issued 25/01/2025; reference SOP DOC-2-MET-PRM-SOP-00037-IE) - Part B source</w:t>
+      </w:r>
+    </w:p>
+    <w:p>
+      <w:pPr>
+        <w:pStyle w:val="ListParagraph"/>
+        <w:numPr>
+          <w:ilvl w:val="0"/>
+          <w:numId w:val="1"/>
+        </w:numPr>
+        <w:spacing w:after="60" w:line="245"/>
+      </w:pPr>
+      <w:r>
+        <w:rPr>
+          <w:rFonts w:ascii="Calibri" w:cs="Calibri" w:eastAsia="Calibri" w:hAnsi="Calibri"/>
+          <w:sz w:val="17"/>
+          <w:szCs w:val="17"/>
+        </w:rPr>
+        <w:t xml:space="preserve">Martabe work instruction 'Elution Survey' DOC-3-MET-PRS-WIN-00053-IE v1.0 (issued 25/12/2024; reference SOP DOC-2-MET-PRM-SOP-00037-IE) - Part C source</w:t>
       </w:r>
     </w:p>
     <w:sectPr>

</xml_diff>

<commit_message>
Convert SWI-PRO-MET-206-002 and 206-004 to Heritage per Martabe decisions; 206 series complete
206-002: GM8902 face velocity at working sash height, average and lowest of 20 readings.
206-004: TPS cube adopted, three-point pH kept, Martabe DO method on HI9142.
201-013: cross-reference updated to 206-004 Step 3. 203-003 hearing protection approved.

Co-Authored-By: Claude Opus 5.5 <noreply@anthropic.com>
Claude-Session: https://claude.ai/code/session_01UHnSDEBA56GANs2gfXuK2P
</commit_message>
<xml_diff>
--- a/SWI/201-Plant-Sampling/MM-4034-033-OR-03-SWI-PRO-MET-201-013-Gold-Elution-Electrowinning-and-Pre-Soak-Solution-Sampling-RevA.docx
+++ b/SWI/201-Plant-Sampling/MM-4034-033-OR-03-SWI-PRO-MET-201-013-Gold-Elution-Electrowinning-and-Pre-Soak-Solution-Sampling-RevA.docx
@@ -6710,7 +6710,7 @@
                 <w:lang w:val="en-AU" w:eastAsia="en-AU"/>
                 <w14:ligatures w14:val="none"/>
               </w:rPr>
-              <w:t xml:space="preserve">Make sure the pH meter is calibrated. If the TPS cube pH meter is used and not calibrated, use SWI-PRO-MET-206-004 Part C. Dip the meter into the sample, wait until the reading is stable and record it.</w:t>
+              <w:t xml:space="preserve">Make sure the pH meter is calibrated. If the TPS cube pH meter is used and not calibrated, use SWI-PRO-MET-206-004 Step 3. Dip the meter into the sample, wait until the reading is stable and record it.</w:t>
             </w:r>
           </w:p>
           <w:p>
@@ -8363,7 +8363,7 @@
                 <w:lang w:eastAsia="en-AU"/>
                 <w14:ligatures w14:val="none"/>
               </w:rPr>
-              <w:t xml:space="preserve">pH, DO and Conductivity Meter Calibration (Part C, TPS cube)</w:t>
+              <w:t xml:space="preserve">pH, DO and Conductivity Meter Calibration (Step 3, TPS cube)</w:t>
             </w:r>
           </w:p>
         </w:tc>

</xml_diff>